<commit_message>
Remove ownership-chain scaffolding from 13 SHCO Purpose sections
"This policy owns X. AAC.2 owns Y. AAC.3 owns Z..." -- same drafting
scaffolding as the "Boundaries:" list already removed from Scope, just
caught separately since it sits in Purpose with no label. Flagged by Mk
after downloading AAC.1 and asking why it was still there.

12 of 13 files: pure ownership chain, nothing else, paragraph deleted.
AAC.1 had one genuinely useful trailing sentence ("The service directory
referred to here is the hospital's own list, not a NABH template") --
kept that, cut only the ownership chain before it.

Verified: table count and heading set/order unchanged on all 13; no
leftover "This policy owns" / "This document owns" paragraph in Purpose
(two remaining matches in COP.2 are unrelated single-sentence
clarifications inside "What we do", not boilerplate, left alone).

Co-Authored-By: Claude Sonnet 5 <noreply@anthropic.com>
Claude-Session: https://claude.ai/code/session_01TPRLtLhmTCP5z94Q3FiE5v
</commit_message>
<xml_diff>
--- a/policies/build/masters/AAC.2_v2_master.docx
+++ b/policies/build/masters/AAC.2_v2_master.docx
@@ -666,18 +666,6 @@
           <w:szCs w:val="22"/>
         </w:rPr>
         <w:t xml:space="preserve">This policy says how «Hospital Name» registers and admits patients, generates a unique identification number, accepts only patients it can serve, manages non-availability of beds, prioritises access by clinical need, and handles transfer-in, transfer-out and referral.</w:t>
-      </w:r>
-    </w:p>
-    <w:p>
-      <w:pPr>
-        <w:spacing w:after="140"/>
-      </w:pPr>
-      <w:r>
-        <w:rPr>
-          <w:sz w:val="22"/>
-          <w:szCs w:val="22"/>
-        </w:rPr>
-        <w:t xml:space="preserve">This policy owns registration, admission and transfer. PRE owns patient information and consent. AAC.3 owns assessment and care plan. AAC.7 owns continuity and handover during care. AAC.8 owns discharge.</w:t>
       </w:r>
     </w:p>
     <w:p>

</xml_diff>